<commit_message>
fix(documents): letterhead banner spans the full page width and is never stretched
Every banner-carrying template now holds the picture as one inline image in a
first-page header (page-wide, top-flush, negative indents) instead of a
hand-placed anchor. A swapped-in letterhead keeps its own proportions at the
page width; downloads, Talabnoma and the live preview share applyLetterhead.

Co-Authored-By: Claude Sonnet 5.5 <noreply@anthropic.com>
Claude-Session: https://claude.ai/code/session_017Bvkx3qJgxasWy8CRohMRx
</commit_message>
<xml_diff>
--- a/src/lib/documents/templates/court_cancel.docx
+++ b/src/lib/documents/templates/court_cancel.docx
@@ -2,133 +2,6 @@
 <file path=word/document.xml><?xml version="1.0" encoding="utf-8"?>
 <w:document xmlns:wpc="http://schemas.microsoft.com/office/word/2010/wordprocessingCanvas" xmlns:mc="http://schemas.openxmlformats.org/markup-compatibility/2006" xmlns:o="urn:schemas-microsoft-com:office:office" xmlns:r="http://schemas.openxmlformats.org/officeDocument/2006/relationships" xmlns:m="http://schemas.openxmlformats.org/officeDocument/2006/math" xmlns:v="urn:schemas-microsoft-com:vml" xmlns:wp14="http://schemas.microsoft.com/office/word/2010/wordprocessingDrawing" xmlns:wp="http://schemas.openxmlformats.org/drawingml/2006/wordprocessingDrawing" xmlns:w10="urn:schemas-microsoft-com:office:word" xmlns:w="http://schemas.openxmlformats.org/wordprocessingml/2006/main" xmlns:w14="http://schemas.microsoft.com/office/word/2010/wordml" xmlns:w15="http://schemas.microsoft.com/office/word/2012/wordml" xmlns:wpg="http://schemas.microsoft.com/office/word/2010/wordprocessingGroup" xmlns:wpi="http://schemas.microsoft.com/office/word/2010/wordprocessingInk" xmlns:wne="http://schemas.microsoft.com/office/word/2006/wordml" xmlns:wps="http://schemas.microsoft.com/office/word/2010/wordprocessingShape" mc:Ignorable="w14 w15 wp14">
   <w:body>
-    <w:p>
-      <w:pPr>
-        <w:spacing w:after="120"/>
-        <w:jc w:val="right"/>
-        <w:rPr>
-          <w:bCs/>
-          <w:sz w:val="26"/>
-          <w:szCs w:val="26"/>
-          <w:lang w:val="en-US"/>
-        </w:rPr>
-      </w:pPr>
-      <w:r>
-        <w:rPr>
-          <w:noProof/>
-        </w:rPr>
-        <w:drawing>
-          <wp:anchor distT="0" distB="0" distL="114300" distR="114300" simplePos="0" relativeHeight="251659264" behindDoc="1" locked="0" layoutInCell="1" allowOverlap="1" wp14:anchorId="23D34869" wp14:editId="7B8DB30A">
-            <wp:simplePos x="0" y="0"/>
-            <wp:positionH relativeFrom="page">
-              <wp:align>left</wp:align>
-            </wp:positionH>
-            <wp:positionV relativeFrom="paragraph">
-              <wp:posOffset>-716593</wp:posOffset>
-            </wp:positionV>
-            <wp:extent cx="7557925" cy="1939644"/>
-            <wp:effectExtent l="0" t="0" r="5080" b="3810"/>
-            <wp:wrapNone/>
-            <wp:docPr id="3" name="Рисунок 3"/>
-            <wp:cNvGraphicFramePr>
-              <a:graphicFrameLocks xmlns:a="http://schemas.openxmlformats.org/drawingml/2006/main" noChangeAspect="1"/>
-            </wp:cNvGraphicFramePr>
-            <a:graphic xmlns:a="http://schemas.openxmlformats.org/drawingml/2006/main">
-              <a:graphicData uri="http://schemas.openxmlformats.org/drawingml/2006/picture">
-                <pic:pic xmlns:pic="http://schemas.openxmlformats.org/drawingml/2006/picture">
-                  <pic:nvPicPr>
-                    <pic:cNvPr id="1" name=""/>
-                    <pic:cNvPicPr/>
-                  </pic:nvPicPr>
-                  <pic:blipFill rotWithShape="1">
-                    <a:blip r:embed="rId5" cstate="print">
-                      <a:extLst>
-                        <a:ext uri="{28A0092B-C50C-407E-A947-70E740481C1C}">
-                          <a14:useLocalDpi xmlns:a14="http://schemas.microsoft.com/office/drawing/2010/main" val="0"/>
-                        </a:ext>
-                      </a:extLst>
-                    </a:blip>
-                    <a:srcRect t="5262" b="11002"/>
-                    <a:stretch/>
-                  </pic:blipFill>
-                  <pic:spPr bwMode="auto">
-                    <a:xfrm>
-                      <a:off x="0" y="0"/>
-                      <a:ext cx="7557925" cy="1939644"/>
-                    </a:xfrm>
-                    <a:prstGeom prst="rect">
-                      <a:avLst/>
-                    </a:prstGeom>
-                    <a:ln>
-                      <a:noFill/>
-                    </a:ln>
-                    <a:extLst>
-                      <a:ext uri="{53640926-AAD7-44D8-BBD7-CCE9431645EC}">
-                        <a14:shadowObscured xmlns:a14="http://schemas.microsoft.com/office/drawing/2010/main"/>
-                      </a:ext>
-                    </a:extLst>
-                  </pic:spPr>
-                </pic:pic>
-              </a:graphicData>
-            </a:graphic>
-            <wp14:sizeRelH relativeFrom="margin">
-              <wp14:pctWidth>0</wp14:pctWidth>
-            </wp14:sizeRelH>
-            <wp14:sizeRelV relativeFrom="margin">
-              <wp14:pctHeight>0</wp14:pctHeight>
-            </wp14:sizeRelV>
-          </wp:anchor>
-        </w:drawing>
-      </w:r>
-    </w:p>
-    <w:p>
-      <w:pPr>
-        <w:spacing w:after="120"/>
-        <w:jc w:val="right"/>
-        <w:rPr>
-          <w:bCs/>
-          <w:sz w:val="26"/>
-          <w:szCs w:val="26"/>
-          <w:lang w:val="en-US"/>
-        </w:rPr>
-      </w:pPr>
-    </w:p>
-    <w:p>
-      <w:pPr>
-        <w:spacing w:after="120"/>
-        <w:jc w:val="right"/>
-        <w:rPr>
-          <w:bCs/>
-          <w:sz w:val="26"/>
-          <w:szCs w:val="26"/>
-          <w:lang w:val="en-US"/>
-        </w:rPr>
-      </w:pPr>
-    </w:p>
-    <w:p>
-      <w:pPr>
-        <w:spacing w:after="120"/>
-        <w:jc w:val="right"/>
-        <w:rPr>
-          <w:bCs/>
-          <w:sz w:val="26"/>
-          <w:szCs w:val="26"/>
-          <w:lang w:val="en-US"/>
-        </w:rPr>
-      </w:pPr>
-    </w:p>
-    <w:p>
-      <w:pPr>
-        <w:spacing w:after="120"/>
-        <w:jc w:val="right"/>
-        <w:rPr>
-          <w:bCs/>
-          <w:sz w:val="26"/>
-          <w:szCs w:val="26"/>
-          <w:lang w:val="en-US"/>
-        </w:rPr>
-      </w:pPr>
-    </w:p>
     <w:tbl>
       <w:tblPr>
         <w:tblStyle w:val="ac"/>
@@ -3614,13 +3487,79 @@
       </w:r>
     </w:p>
     <w:sectPr>
+      <w:headerReference w:type="first" r:id="rIdBanner"/>
       <w:pgSz w:w="11906" w:h="16838"/>
-      <w:pgMar w:top="1134" w:right="850" w:bottom="1134" w:left="1701" w:header="708" w:footer="708" w:gutter="0"/>
+      <w:pgMar w:top="1134" w:right="850" w:bottom="1134" w:left="1701" w:header="0" w:footer="708" w:gutter="0"/>
       <w:cols w:space="720"/>
+      <w:titlePg/>
       <w:docGrid w:linePitch="360"/>
     </w:sectPr>
   </w:body>
 </w:document>
+</file>
+
+<file path=word/header1.xml><?xml version="1.0" encoding="utf-8"?>
+<w:hdr xmlns:w="http://schemas.openxmlformats.org/wordprocessingml/2006/main" xmlns:r="http://schemas.openxmlformats.org/officeDocument/2006/relationships" xmlns:wp="http://schemas.openxmlformats.org/drawingml/2006/wordprocessingDrawing">
+  <w:p>
+    <w:pPr>
+      <w:spacing w:before="0" w:after="120" w:line="240" w:lineRule="auto"/>
+      <w:ind w:left="-1701" w:right="-850"/>
+    </w:pPr>
+    <w:r>
+      <w:rPr>
+        <w:noProof/>
+      </w:rPr>
+      <w:drawing>
+        <wp:inline distT="0" distB="0" distL="0" distR="0">
+          <wp:extent cx="7560310" cy="1940309"/>
+          <wp:effectExtent l="0" t="0" r="0" b="0"/>
+          <wp:docPr id="1" name="Banner"/>
+          <wp:cNvGraphicFramePr>
+            <a:graphicFrameLocks xmlns:a="http://schemas.openxmlformats.org/drawingml/2006/main" noChangeAspect="1"/>
+          </wp:cNvGraphicFramePr>
+          <a:graphic xmlns:a="http://schemas.openxmlformats.org/drawingml/2006/main">
+            <a:graphicData uri="http://schemas.openxmlformats.org/drawingml/2006/picture">
+              <pic:pic xmlns:pic="http://schemas.openxmlformats.org/drawingml/2006/picture">
+                <pic:nvPicPr>
+                  <pic:cNvPr id="1" name=""/>
+                  <pic:cNvPicPr/>
+                </pic:nvPicPr>
+                <pic:blipFill rotWithShape="1">
+                  <a:blip r:embed="rId1" cstate="print">
+                    <a:extLst>
+                      <a:ext uri="{28A0092B-C50C-407E-A947-70E740481C1C}">
+                        <a14:useLocalDpi xmlns:a14="http://schemas.microsoft.com/office/drawing/2010/main" val="0"/>
+                      </a:ext>
+                    </a:extLst>
+                  </a:blip>
+                  <a:srcRect t="5262" b="11002"/>
+                  <a:stretch/>
+                </pic:blipFill>
+                <pic:spPr bwMode="auto">
+                  <a:xfrm>
+                    <a:off x="0" y="0"/>
+                    <a:ext cx="7560310" cy="1940309"/>
+                  </a:xfrm>
+                  <a:prstGeom prst="rect">
+                    <a:avLst/>
+                  </a:prstGeom>
+                  <a:ln>
+                    <a:noFill/>
+                  </a:ln>
+                  <a:extLst>
+                    <a:ext uri="{53640926-AAD7-44D8-BBD7-CCE9431645EC}">
+                      <a14:shadowObscured xmlns:a14="http://schemas.microsoft.com/office/drawing/2010/main"/>
+                    </a:ext>
+                  </a:extLst>
+                </pic:spPr>
+              </pic:pic>
+            </a:graphicData>
+          </a:graphic>
+        </wp:inline>
+      </w:drawing>
+    </w:r>
+  </w:p>
+</w:hdr>
 </file>
 
 <file path=word/numbering.xml><?xml version="1.0" encoding="utf-8"?>

</xml_diff>